<commit_message>
Sync TCS Word document with lift/lower bit-weight docs.
Regenerate docx from updated markdown guide.
</commit_message>
<xml_diff>
--- a/remas/TCS_STRUCT/Word Document/tcs-logger-mtos-current.docx
+++ b/remas/TCS_STRUCT/Word Document/tcs-logger-mtos-current.docx
@@ -163,7 +163,6 @@
     </w:p>
     <w:p>
       <w:pPr>
-        <w:spacing w:before="120" w:after="120"/>
         <w:shd w:fill="F5F5F5" w:val="clear"/>
       </w:pPr>
       <w:r>
@@ -741,7 +740,7 @@
           <w:i w:val="0"/>
           <w:sz w:val="22"/>
         </w:rPr>
-        <w:t>, bits 0 and 2 are set → thrusters 0 and 2 are running.</w:t>
+        <w:t>, bits 0 and 2 are set -&gt; thrusters 0 and 2 are running.</w:t>
       </w:r>
     </w:p>
     <w:p>
@@ -3345,6 +3344,780 @@
           <w:i w:val="0"/>
           <w:sz w:val="22"/>
         </w:rPr>
+        <w:t xml:space="preserve">For </w:t>
+      </w:r>
+      <w:r>
+        <w:rPr>
+          <w:rFonts w:ascii="Consolas" w:hAnsi="Consolas" w:eastAsia="Consolas"/>
+          <w:b w:val="0"/>
+          <w:i w:val="0"/>
+          <w:color w:val="333333"/>
+          <w:sz w:val="20"/>
+        </w:rPr>
+        <w:t>sLiftCylinderUpperLocked</w:t>
+      </w:r>
+      <w:r>
+        <w:rPr>
+          <w:rFonts w:ascii="Calibri" w:hAnsi="Calibri" w:eastAsia="Calibri"/>
+          <w:b w:val="0"/>
+          <w:i w:val="0"/>
+          <w:sz w:val="22"/>
+        </w:rPr>
+        <w:t xml:space="preserve"> and </w:t>
+      </w:r>
+      <w:r>
+        <w:rPr>
+          <w:rFonts w:ascii="Consolas" w:hAnsi="Consolas" w:eastAsia="Consolas"/>
+          <w:b w:val="0"/>
+          <w:i w:val="0"/>
+          <w:color w:val="333333"/>
+          <w:sz w:val="20"/>
+        </w:rPr>
+        <w:t>sLiftCylinderLowerLocked</w:t>
+      </w:r>
+      <w:r>
+        <w:rPr>
+          <w:rFonts w:ascii="Calibri" w:hAnsi="Calibri" w:eastAsia="Calibri"/>
+          <w:b w:val="0"/>
+          <w:i w:val="0"/>
+          <w:sz w:val="22"/>
+        </w:rPr>
+        <w:t>, bit weight depends on thruster number (</w:t>
+      </w:r>
+      <w:r>
+        <w:rPr>
+          <w:rFonts w:ascii="Consolas" w:hAnsi="Consolas" w:eastAsia="Consolas"/>
+          <w:b w:val="0"/>
+          <w:i w:val="0"/>
+          <w:color w:val="333333"/>
+          <w:sz w:val="20"/>
+        </w:rPr>
+        <w:t>#1</w:t>
+      </w:r>
+      <w:r>
+        <w:rPr>
+          <w:rFonts w:ascii="Calibri" w:hAnsi="Calibri" w:eastAsia="Calibri"/>
+          <w:b w:val="0"/>
+          <w:i w:val="0"/>
+          <w:sz w:val="22"/>
+        </w:rPr>
+        <w:t xml:space="preserve"> = bit 0, </w:t>
+      </w:r>
+      <w:r>
+        <w:rPr>
+          <w:rFonts w:ascii="Consolas" w:hAnsi="Consolas" w:eastAsia="Consolas"/>
+          <w:b w:val="0"/>
+          <w:i w:val="0"/>
+          <w:color w:val="333333"/>
+          <w:sz w:val="20"/>
+        </w:rPr>
+        <w:t>#2</w:t>
+      </w:r>
+      <w:r>
+        <w:rPr>
+          <w:rFonts w:ascii="Calibri" w:hAnsi="Calibri" w:eastAsia="Calibri"/>
+          <w:b w:val="0"/>
+          <w:i w:val="0"/>
+          <w:sz w:val="22"/>
+        </w:rPr>
+        <w:t xml:space="preserve"> = bit 1, ...):</w:t>
+      </w:r>
+    </w:p>
+    <w:tbl>
+      <w:tblPr>
+        <w:tblStyle w:val="TableGrid"/>
+        <w:tblW w:type="auto" w:w="0"/>
+        <w:tblLook w:firstColumn="1" w:firstRow="1" w:lastColumn="0" w:lastRow="0" w:noHBand="0" w:noVBand="1" w:val="04A0"/>
+      </w:tblPr>
+      <w:tblGrid>
+        <w:gridCol w:w="4824"/>
+        <w:gridCol w:w="4824"/>
+      </w:tblGrid>
+      <w:tr>
+        <w:tc>
+          <w:tcPr>
+            <w:tcW w:type="dxa" w:w="4824"/>
+            <w:shd w:fill="1F4E79" w:val="clear"/>
+          </w:tcPr>
+          <w:p>
+            <w:r/>
+            <w:r>
+              <w:rPr>
+                <w:rFonts w:ascii="Calibri" w:hAnsi="Calibri" w:eastAsia="Calibri"/>
+                <w:b/>
+                <w:i w:val="0"/>
+                <w:color w:val="FFFFFF"/>
+                <w:sz w:val="20"/>
+              </w:rPr>
+              <w:t>Thruster number</w:t>
+            </w:r>
+          </w:p>
+        </w:tc>
+        <w:tc>
+          <w:tcPr>
+            <w:tcW w:type="dxa" w:w="4824"/>
+            <w:shd w:fill="1F4E79" w:val="clear"/>
+          </w:tcPr>
+          <w:p>
+            <w:r/>
+            <w:r>
+              <w:rPr>
+                <w:rFonts w:ascii="Calibri" w:hAnsi="Calibri" w:eastAsia="Calibri"/>
+                <w:b/>
+                <w:i w:val="0"/>
+                <w:color w:val="FFFFFF"/>
+                <w:sz w:val="20"/>
+              </w:rPr>
+              <w:t>Bit weight</w:t>
+            </w:r>
+          </w:p>
+        </w:tc>
+      </w:tr>
+      <w:tr>
+        <w:tc>
+          <w:tcPr>
+            <w:tcW w:type="dxa" w:w="4824"/>
+          </w:tcPr>
+          <w:p>
+            <w:r/>
+            <w:r>
+              <w:rPr>
+                <w:rFonts w:ascii="Calibri" w:hAnsi="Calibri" w:eastAsia="Calibri"/>
+                <w:b w:val="0"/>
+                <w:i w:val="0"/>
+                <w:sz w:val="20"/>
+              </w:rPr>
+              <w:t>#1</w:t>
+            </w:r>
+          </w:p>
+        </w:tc>
+        <w:tc>
+          <w:tcPr>
+            <w:tcW w:type="dxa" w:w="4824"/>
+          </w:tcPr>
+          <w:p>
+            <w:r/>
+            <w:r>
+              <w:rPr>
+                <w:rFonts w:ascii="Calibri" w:hAnsi="Calibri" w:eastAsia="Calibri"/>
+                <w:b w:val="0"/>
+                <w:i w:val="0"/>
+                <w:sz w:val="20"/>
+              </w:rPr>
+              <w:t>1</w:t>
+            </w:r>
+          </w:p>
+        </w:tc>
+      </w:tr>
+      <w:tr>
+        <w:tc>
+          <w:tcPr>
+            <w:tcW w:type="dxa" w:w="4824"/>
+            <w:shd w:fill="EEF3F8" w:val="clear"/>
+          </w:tcPr>
+          <w:p>
+            <w:r/>
+            <w:r>
+              <w:rPr>
+                <w:rFonts w:ascii="Calibri" w:hAnsi="Calibri" w:eastAsia="Calibri"/>
+                <w:b w:val="0"/>
+                <w:i w:val="0"/>
+                <w:sz w:val="20"/>
+              </w:rPr>
+              <w:t>#2</w:t>
+            </w:r>
+          </w:p>
+        </w:tc>
+        <w:tc>
+          <w:tcPr>
+            <w:tcW w:type="dxa" w:w="4824"/>
+            <w:shd w:fill="EEF3F8" w:val="clear"/>
+          </w:tcPr>
+          <w:p>
+            <w:r/>
+            <w:r>
+              <w:rPr>
+                <w:rFonts w:ascii="Calibri" w:hAnsi="Calibri" w:eastAsia="Calibri"/>
+                <w:b w:val="0"/>
+                <w:i w:val="0"/>
+                <w:sz w:val="20"/>
+              </w:rPr>
+              <w:t>2</w:t>
+            </w:r>
+          </w:p>
+        </w:tc>
+      </w:tr>
+      <w:tr>
+        <w:tc>
+          <w:tcPr>
+            <w:tcW w:type="dxa" w:w="4824"/>
+          </w:tcPr>
+          <w:p>
+            <w:r/>
+            <w:r>
+              <w:rPr>
+                <w:rFonts w:ascii="Calibri" w:hAnsi="Calibri" w:eastAsia="Calibri"/>
+                <w:b w:val="0"/>
+                <w:i w:val="0"/>
+                <w:sz w:val="20"/>
+              </w:rPr>
+              <w:t>#3</w:t>
+            </w:r>
+          </w:p>
+        </w:tc>
+        <w:tc>
+          <w:tcPr>
+            <w:tcW w:type="dxa" w:w="4824"/>
+          </w:tcPr>
+          <w:p>
+            <w:r/>
+            <w:r>
+              <w:rPr>
+                <w:rFonts w:ascii="Calibri" w:hAnsi="Calibri" w:eastAsia="Calibri"/>
+                <w:b w:val="0"/>
+                <w:i w:val="0"/>
+                <w:sz w:val="20"/>
+              </w:rPr>
+              <w:t>4</w:t>
+            </w:r>
+          </w:p>
+        </w:tc>
+      </w:tr>
+      <w:tr>
+        <w:tc>
+          <w:tcPr>
+            <w:tcW w:type="dxa" w:w="4824"/>
+            <w:shd w:fill="EEF3F8" w:val="clear"/>
+          </w:tcPr>
+          <w:p>
+            <w:r/>
+            <w:r>
+              <w:rPr>
+                <w:rFonts w:ascii="Calibri" w:hAnsi="Calibri" w:eastAsia="Calibri"/>
+                <w:b w:val="0"/>
+                <w:i w:val="0"/>
+                <w:sz w:val="20"/>
+              </w:rPr>
+              <w:t>#4</w:t>
+            </w:r>
+          </w:p>
+        </w:tc>
+        <w:tc>
+          <w:tcPr>
+            <w:tcW w:type="dxa" w:w="4824"/>
+            <w:shd w:fill="EEF3F8" w:val="clear"/>
+          </w:tcPr>
+          <w:p>
+            <w:r/>
+            <w:r>
+              <w:rPr>
+                <w:rFonts w:ascii="Calibri" w:hAnsi="Calibri" w:eastAsia="Calibri"/>
+                <w:b w:val="0"/>
+                <w:i w:val="0"/>
+                <w:sz w:val="20"/>
+              </w:rPr>
+              <w:t>8</w:t>
+            </w:r>
+          </w:p>
+        </w:tc>
+      </w:tr>
+      <w:tr>
+        <w:tc>
+          <w:tcPr>
+            <w:tcW w:type="dxa" w:w="4824"/>
+          </w:tcPr>
+          <w:p>
+            <w:r/>
+            <w:r>
+              <w:rPr>
+                <w:rFonts w:ascii="Calibri" w:hAnsi="Calibri" w:eastAsia="Calibri"/>
+                <w:b w:val="0"/>
+                <w:i w:val="0"/>
+                <w:sz w:val="20"/>
+              </w:rPr>
+              <w:t>#5</w:t>
+            </w:r>
+          </w:p>
+        </w:tc>
+        <w:tc>
+          <w:tcPr>
+            <w:tcW w:type="dxa" w:w="4824"/>
+          </w:tcPr>
+          <w:p>
+            <w:r/>
+            <w:r>
+              <w:rPr>
+                <w:rFonts w:ascii="Calibri" w:hAnsi="Calibri" w:eastAsia="Calibri"/>
+                <w:b w:val="0"/>
+                <w:i w:val="0"/>
+                <w:sz w:val="20"/>
+              </w:rPr>
+              <w:t>16</w:t>
+            </w:r>
+          </w:p>
+        </w:tc>
+      </w:tr>
+      <w:tr>
+        <w:tc>
+          <w:tcPr>
+            <w:tcW w:type="dxa" w:w="4824"/>
+            <w:shd w:fill="EEF3F8" w:val="clear"/>
+          </w:tcPr>
+          <w:p>
+            <w:r/>
+            <w:r>
+              <w:rPr>
+                <w:rFonts w:ascii="Calibri" w:hAnsi="Calibri" w:eastAsia="Calibri"/>
+                <w:b w:val="0"/>
+                <w:i w:val="0"/>
+                <w:sz w:val="20"/>
+              </w:rPr>
+              <w:t>#6</w:t>
+            </w:r>
+          </w:p>
+        </w:tc>
+        <w:tc>
+          <w:tcPr>
+            <w:tcW w:type="dxa" w:w="4824"/>
+            <w:shd w:fill="EEF3F8" w:val="clear"/>
+          </w:tcPr>
+          <w:p>
+            <w:r/>
+            <w:r>
+              <w:rPr>
+                <w:rFonts w:ascii="Calibri" w:hAnsi="Calibri" w:eastAsia="Calibri"/>
+                <w:b w:val="0"/>
+                <w:i w:val="0"/>
+                <w:sz w:val="20"/>
+              </w:rPr>
+              <w:t>32</w:t>
+            </w:r>
+          </w:p>
+        </w:tc>
+      </w:tr>
+      <w:tr>
+        <w:tc>
+          <w:tcPr>
+            <w:tcW w:type="dxa" w:w="4824"/>
+          </w:tcPr>
+          <w:p>
+            <w:r/>
+            <w:r>
+              <w:rPr>
+                <w:rFonts w:ascii="Calibri" w:hAnsi="Calibri" w:eastAsia="Calibri"/>
+                <w:b w:val="0"/>
+                <w:i w:val="0"/>
+                <w:sz w:val="20"/>
+              </w:rPr>
+              <w:t>#7</w:t>
+            </w:r>
+          </w:p>
+        </w:tc>
+        <w:tc>
+          <w:tcPr>
+            <w:tcW w:type="dxa" w:w="4824"/>
+          </w:tcPr>
+          <w:p>
+            <w:r/>
+            <w:r>
+              <w:rPr>
+                <w:rFonts w:ascii="Calibri" w:hAnsi="Calibri" w:eastAsia="Calibri"/>
+                <w:b w:val="0"/>
+                <w:i w:val="0"/>
+                <w:sz w:val="20"/>
+              </w:rPr>
+              <w:t>64</w:t>
+            </w:r>
+          </w:p>
+        </w:tc>
+      </w:tr>
+      <w:tr>
+        <w:tc>
+          <w:tcPr>
+            <w:tcW w:type="dxa" w:w="4824"/>
+            <w:shd w:fill="EEF3F8" w:val="clear"/>
+          </w:tcPr>
+          <w:p>
+            <w:r/>
+            <w:r>
+              <w:rPr>
+                <w:rFonts w:ascii="Calibri" w:hAnsi="Calibri" w:eastAsia="Calibri"/>
+                <w:b w:val="0"/>
+                <w:i w:val="0"/>
+                <w:sz w:val="20"/>
+              </w:rPr>
+              <w:t>#8</w:t>
+            </w:r>
+          </w:p>
+        </w:tc>
+        <w:tc>
+          <w:tcPr>
+            <w:tcW w:type="dxa" w:w="4824"/>
+            <w:shd w:fill="EEF3F8" w:val="clear"/>
+          </w:tcPr>
+          <w:p>
+            <w:r/>
+            <w:r>
+              <w:rPr>
+                <w:rFonts w:ascii="Calibri" w:hAnsi="Calibri" w:eastAsia="Calibri"/>
+                <w:b w:val="0"/>
+                <w:i w:val="0"/>
+                <w:sz w:val="20"/>
+              </w:rPr>
+              <w:t>128</w:t>
+            </w:r>
+          </w:p>
+        </w:tc>
+      </w:tr>
+      <w:tr>
+        <w:tc>
+          <w:tcPr>
+            <w:tcW w:type="dxa" w:w="4824"/>
+          </w:tcPr>
+          <w:p>
+            <w:r/>
+            <w:r>
+              <w:rPr>
+                <w:rFonts w:ascii="Calibri" w:hAnsi="Calibri" w:eastAsia="Calibri"/>
+                <w:b w:val="0"/>
+                <w:i w:val="0"/>
+                <w:sz w:val="20"/>
+              </w:rPr>
+              <w:t>#9</w:t>
+            </w:r>
+          </w:p>
+        </w:tc>
+        <w:tc>
+          <w:tcPr>
+            <w:tcW w:type="dxa" w:w="4824"/>
+          </w:tcPr>
+          <w:p>
+            <w:r/>
+            <w:r>
+              <w:rPr>
+                <w:rFonts w:ascii="Calibri" w:hAnsi="Calibri" w:eastAsia="Calibri"/>
+                <w:b w:val="0"/>
+                <w:i w:val="0"/>
+                <w:sz w:val="20"/>
+              </w:rPr>
+              <w:t>256</w:t>
+            </w:r>
+          </w:p>
+        </w:tc>
+      </w:tr>
+      <w:tr>
+        <w:tc>
+          <w:tcPr>
+            <w:tcW w:type="dxa" w:w="4824"/>
+            <w:shd w:fill="EEF3F8" w:val="clear"/>
+          </w:tcPr>
+          <w:p>
+            <w:r/>
+            <w:r>
+              <w:rPr>
+                <w:rFonts w:ascii="Calibri" w:hAnsi="Calibri" w:eastAsia="Calibri"/>
+                <w:b w:val="0"/>
+                <w:i w:val="0"/>
+                <w:sz w:val="20"/>
+              </w:rPr>
+              <w:t>#10</w:t>
+            </w:r>
+          </w:p>
+        </w:tc>
+        <w:tc>
+          <w:tcPr>
+            <w:tcW w:type="dxa" w:w="4824"/>
+            <w:shd w:fill="EEF3F8" w:val="clear"/>
+          </w:tcPr>
+          <w:p>
+            <w:r/>
+            <w:r>
+              <w:rPr>
+                <w:rFonts w:ascii="Calibri" w:hAnsi="Calibri" w:eastAsia="Calibri"/>
+                <w:b w:val="0"/>
+                <w:i w:val="0"/>
+                <w:sz w:val="20"/>
+              </w:rPr>
+              <w:t>512</w:t>
+            </w:r>
+          </w:p>
+        </w:tc>
+      </w:tr>
+    </w:tbl>
+    <w:p/>
+    <w:p>
+      <w:r>
+        <w:rPr>
+          <w:rFonts w:ascii="Calibri" w:hAnsi="Calibri" w:eastAsia="Calibri"/>
+          <w:b w:val="0"/>
+          <w:i w:val="0"/>
+          <w:sz w:val="22"/>
+        </w:rPr>
+        <w:t>To calculate an expected value, add the bit weights of the retractable thrusters that currently have that lock active. Clear bits for thrusters that do not have the lock (or are not retractable).</w:t>
+      </w:r>
+    </w:p>
+    <w:p>
+      <w:r>
+        <w:rPr>
+          <w:rFonts w:ascii="Calibri" w:hAnsi="Calibri" w:eastAsia="Calibri"/>
+          <w:b w:val="0"/>
+          <w:i w:val="0"/>
+          <w:sz w:val="22"/>
+        </w:rPr>
+        <w:t>Examples:</w:t>
+      </w:r>
+    </w:p>
+    <w:p>
+      <w:pPr>
+        <w:pStyle w:val="ListBullet"/>
+      </w:pPr>
+      <w:r>
+        <w:rPr>
+          <w:rFonts w:ascii="Calibri" w:hAnsi="Calibri" w:eastAsia="Calibri"/>
+          <w:b w:val="0"/>
+          <w:i w:val="0"/>
+          <w:sz w:val="22"/>
+        </w:rPr>
+        <w:t xml:space="preserve">Retractables </w:t>
+      </w:r>
+      <w:r>
+        <w:rPr>
+          <w:rFonts w:ascii="Consolas" w:hAnsi="Consolas" w:eastAsia="Consolas"/>
+          <w:b w:val="0"/>
+          <w:i w:val="0"/>
+          <w:color w:val="333333"/>
+          <w:sz w:val="20"/>
+        </w:rPr>
+        <w:t>#3</w:t>
+      </w:r>
+      <w:r>
+        <w:rPr>
+          <w:rFonts w:ascii="Calibri" w:hAnsi="Calibri" w:eastAsia="Calibri"/>
+          <w:b w:val="0"/>
+          <w:i w:val="0"/>
+          <w:sz w:val="22"/>
+        </w:rPr>
+        <w:t xml:space="preserve"> and </w:t>
+      </w:r>
+      <w:r>
+        <w:rPr>
+          <w:rFonts w:ascii="Consolas" w:hAnsi="Consolas" w:eastAsia="Consolas"/>
+          <w:b w:val="0"/>
+          <w:i w:val="0"/>
+          <w:color w:val="333333"/>
+          <w:sz w:val="20"/>
+        </w:rPr>
+        <w:t>#4</w:t>
+      </w:r>
+      <w:r>
+        <w:rPr>
+          <w:rFonts w:ascii="Calibri" w:hAnsi="Calibri" w:eastAsia="Calibri"/>
+          <w:b w:val="0"/>
+          <w:i w:val="0"/>
+          <w:sz w:val="22"/>
+        </w:rPr>
+        <w:t xml:space="preserve">, both upper-locked -&gt; Upper = </w:t>
+      </w:r>
+      <w:r>
+        <w:rPr>
+          <w:rFonts w:ascii="Consolas" w:hAnsi="Consolas" w:eastAsia="Consolas"/>
+          <w:b w:val="0"/>
+          <w:i w:val="0"/>
+          <w:color w:val="333333"/>
+          <w:sz w:val="20"/>
+        </w:rPr>
+        <w:t>4 + 8 = 12</w:t>
+      </w:r>
+      <w:r>
+        <w:rPr>
+          <w:rFonts w:ascii="Calibri" w:hAnsi="Calibri" w:eastAsia="Calibri"/>
+          <w:b w:val="0"/>
+          <w:i w:val="0"/>
+          <w:sz w:val="22"/>
+        </w:rPr>
+        <w:t xml:space="preserve">, Lower = </w:t>
+      </w:r>
+      <w:r>
+        <w:rPr>
+          <w:rFonts w:ascii="Consolas" w:hAnsi="Consolas" w:eastAsia="Consolas"/>
+          <w:b w:val="0"/>
+          <w:i w:val="0"/>
+          <w:color w:val="333333"/>
+          <w:sz w:val="20"/>
+        </w:rPr>
+        <w:t>0</w:t>
+      </w:r>
+    </w:p>
+    <w:p>
+      <w:pPr>
+        <w:pStyle w:val="ListBullet"/>
+      </w:pPr>
+      <w:r>
+        <w:rPr>
+          <w:rFonts w:ascii="Calibri" w:hAnsi="Calibri" w:eastAsia="Calibri"/>
+          <w:b w:val="0"/>
+          <w:i w:val="0"/>
+          <w:sz w:val="22"/>
+        </w:rPr>
+        <w:t xml:space="preserve">Retractables </w:t>
+      </w:r>
+      <w:r>
+        <w:rPr>
+          <w:rFonts w:ascii="Consolas" w:hAnsi="Consolas" w:eastAsia="Consolas"/>
+          <w:b w:val="0"/>
+          <w:i w:val="0"/>
+          <w:color w:val="333333"/>
+          <w:sz w:val="20"/>
+        </w:rPr>
+        <w:t>#2</w:t>
+      </w:r>
+      <w:r>
+        <w:rPr>
+          <w:rFonts w:ascii="Calibri" w:hAnsi="Calibri" w:eastAsia="Calibri"/>
+          <w:b w:val="0"/>
+          <w:i w:val="0"/>
+          <w:sz w:val="22"/>
+        </w:rPr>
+        <w:t xml:space="preserve"> and </w:t>
+      </w:r>
+      <w:r>
+        <w:rPr>
+          <w:rFonts w:ascii="Consolas" w:hAnsi="Consolas" w:eastAsia="Consolas"/>
+          <w:b w:val="0"/>
+          <w:i w:val="0"/>
+          <w:color w:val="333333"/>
+          <w:sz w:val="20"/>
+        </w:rPr>
+        <w:t>#4</w:t>
+      </w:r>
+      <w:r>
+        <w:rPr>
+          <w:rFonts w:ascii="Calibri" w:hAnsi="Calibri" w:eastAsia="Calibri"/>
+          <w:b w:val="0"/>
+          <w:i w:val="0"/>
+          <w:sz w:val="22"/>
+        </w:rPr>
+        <w:t xml:space="preserve">, only </w:t>
+      </w:r>
+      <w:r>
+        <w:rPr>
+          <w:rFonts w:ascii="Consolas" w:hAnsi="Consolas" w:eastAsia="Consolas"/>
+          <w:b w:val="0"/>
+          <w:i w:val="0"/>
+          <w:color w:val="333333"/>
+          <w:sz w:val="20"/>
+        </w:rPr>
+        <w:t>#2</w:t>
+      </w:r>
+      <w:r>
+        <w:rPr>
+          <w:rFonts w:ascii="Calibri" w:hAnsi="Calibri" w:eastAsia="Calibri"/>
+          <w:b w:val="0"/>
+          <w:i w:val="0"/>
+          <w:sz w:val="22"/>
+        </w:rPr>
+        <w:t xml:space="preserve"> lower-locked -&gt; Lower = </w:t>
+      </w:r>
+      <w:r>
+        <w:rPr>
+          <w:rFonts w:ascii="Consolas" w:hAnsi="Consolas" w:eastAsia="Consolas"/>
+          <w:b w:val="0"/>
+          <w:i w:val="0"/>
+          <w:color w:val="333333"/>
+          <w:sz w:val="20"/>
+        </w:rPr>
+        <w:t>2</w:t>
+      </w:r>
+      <w:r>
+        <w:rPr>
+          <w:rFonts w:ascii="Calibri" w:hAnsi="Calibri" w:eastAsia="Calibri"/>
+          <w:b w:val="0"/>
+          <w:i w:val="0"/>
+          <w:sz w:val="22"/>
+        </w:rPr>
+        <w:t xml:space="preserve">, Upper = </w:t>
+      </w:r>
+      <w:r>
+        <w:rPr>
+          <w:rFonts w:ascii="Consolas" w:hAnsi="Consolas" w:eastAsia="Consolas"/>
+          <w:b w:val="0"/>
+          <w:i w:val="0"/>
+          <w:color w:val="333333"/>
+          <w:sz w:val="20"/>
+        </w:rPr>
+        <w:t>0</w:t>
+      </w:r>
+    </w:p>
+    <w:p>
+      <w:pPr>
+        <w:pStyle w:val="ListBullet"/>
+      </w:pPr>
+      <w:r>
+        <w:rPr>
+          <w:rFonts w:ascii="Calibri" w:hAnsi="Calibri" w:eastAsia="Calibri"/>
+          <w:b w:val="0"/>
+          <w:i w:val="0"/>
+          <w:sz w:val="22"/>
+        </w:rPr>
+        <w:t xml:space="preserve">Retractables </w:t>
+      </w:r>
+      <w:r>
+        <w:rPr>
+          <w:rFonts w:ascii="Consolas" w:hAnsi="Consolas" w:eastAsia="Consolas"/>
+          <w:b w:val="0"/>
+          <w:i w:val="0"/>
+          <w:color w:val="333333"/>
+          <w:sz w:val="20"/>
+        </w:rPr>
+        <w:t>#2</w:t>
+      </w:r>
+      <w:r>
+        <w:rPr>
+          <w:rFonts w:ascii="Calibri" w:hAnsi="Calibri" w:eastAsia="Calibri"/>
+          <w:b w:val="0"/>
+          <w:i w:val="0"/>
+          <w:sz w:val="22"/>
+        </w:rPr>
+        <w:t xml:space="preserve"> and </w:t>
+      </w:r>
+      <w:r>
+        <w:rPr>
+          <w:rFonts w:ascii="Consolas" w:hAnsi="Consolas" w:eastAsia="Consolas"/>
+          <w:b w:val="0"/>
+          <w:i w:val="0"/>
+          <w:color w:val="333333"/>
+          <w:sz w:val="20"/>
+        </w:rPr>
+        <w:t>#4</w:t>
+      </w:r>
+      <w:r>
+        <w:rPr>
+          <w:rFonts w:ascii="Calibri" w:hAnsi="Calibri" w:eastAsia="Calibri"/>
+          <w:b w:val="0"/>
+          <w:i w:val="0"/>
+          <w:sz w:val="22"/>
+        </w:rPr>
+        <w:t xml:space="preserve">, both lower-locked -&gt; Lower = </w:t>
+      </w:r>
+      <w:r>
+        <w:rPr>
+          <w:rFonts w:ascii="Consolas" w:hAnsi="Consolas" w:eastAsia="Consolas"/>
+          <w:b w:val="0"/>
+          <w:i w:val="0"/>
+          <w:color w:val="333333"/>
+          <w:sz w:val="20"/>
+        </w:rPr>
+        <w:t>2 + 8 = 10</w:t>
+      </w:r>
+    </w:p>
+    <w:p>
+      <w:r>
+        <w:rPr>
+          <w:rFonts w:ascii="Calibri" w:hAnsi="Calibri" w:eastAsia="Calibri"/>
+          <w:b w:val="0"/>
+          <w:i w:val="0"/>
+          <w:sz w:val="22"/>
+        </w:rPr>
         <w:t xml:space="preserve">Common thruster state logic for slot </w:t>
       </w:r>
       <w:r>
@@ -3378,7 +4151,7 @@
           <w:i w:val="0"/>
           <w:sz w:val="22"/>
         </w:rPr>
-        <w:t>Fault bit set → Fault</w:t>
+        <w:t>Fault bit set -&gt; Fault</w:t>
       </w:r>
     </w:p>
     <w:p>
@@ -3392,7 +4165,7 @@
           <w:i w:val="0"/>
           <w:sz w:val="22"/>
         </w:rPr>
-        <w:t>Else running bit set → Running</w:t>
+        <w:t>Else running bit set -&gt; Running</w:t>
       </w:r>
     </w:p>
     <w:p>
@@ -3406,7 +4179,7 @@
           <w:i w:val="0"/>
           <w:sz w:val="22"/>
         </w:rPr>
-        <w:t>Else ready bit set → Ready</w:t>
+        <w:t>Else ready bit set -&gt; Ready</w:t>
       </w:r>
     </w:p>
     <w:p>
@@ -3420,7 +4193,7 @@
           <w:i w:val="0"/>
           <w:sz w:val="22"/>
         </w:rPr>
-        <w:t>Else → Stopped / unavailable</w:t>
+        <w:t>Else -&gt; Stopped / unavailable</w:t>
       </w:r>
     </w:p>
     <w:p>

</xml_diff>